<commit_message>
WIP Define tests for complimentary relations
</commit_message>
<xml_diff>
--- a/docs/Shapes and Relations in 2D.docx
+++ b/docs/Shapes and Relations in 2D.docx
@@ -1,6 +1,6 @@
 
 <file path=word/document.xml><?xml version="1.0" encoding="utf-8"?>
-<w:document xmlns:wpc="http://schemas.microsoft.com/office/word/2010/wordprocessingCanvas" xmlns:cx="http://schemas.microsoft.com/office/drawing/2014/chartex" xmlns:cx1="http://schemas.microsoft.com/office/drawing/2015/9/8/chartex" xmlns:cx2="http://schemas.microsoft.com/office/drawing/2015/10/21/chartex" xmlns:cx3="http://schemas.microsoft.com/office/drawing/2016/5/9/chartex" xmlns:cx4="http://schemas.microsoft.com/office/drawing/2016/5/10/chartex" xmlns:cx5="http://schemas.microsoft.com/office/drawing/2016/5/11/chartex" xmlns:cx6="http://schemas.microsoft.com/office/drawing/2016/5/12/chartex" xmlns:cx7="http://schemas.microsoft.com/office/drawing/2016/5/13/chartex" xmlns:cx8="http://schemas.microsoft.com/office/drawing/2016/5/14/chartex" xmlns:mc="http://schemas.openxmlformats.org/markup-compatibility/2006" xmlns:aink="http://schemas.microsoft.com/office/drawing/2016/ink" xmlns:am3d="http://schemas.microsoft.com/office/drawing/2017/model3d" xmlns:o="urn:schemas-microsoft-com:office:office" xmlns:oel="http://schemas.microsoft.com/office/2019/extlst" xmlns:r="http://schemas.openxmlformats.org/officeDocument/2006/relationships" xmlns:m="http://schemas.openxmlformats.org/officeDocument/2006/math" xmlns:v="urn:schemas-microsoft-com:vml" xmlns:wp14="http://schemas.microsoft.com/office/word/2010/wordprocessingDrawing" xmlns:wp="http://schemas.openxmlformats.org/drawingml/2006/wordprocessingDrawing" xmlns:w10="urn:schemas-microsoft-com:office:word" xmlns:w="http://schemas.openxmlformats.org/wordprocessingml/2006/main" xmlns:w14="http://schemas.microsoft.com/office/word/2010/wordml" xmlns:w15="http://schemas.microsoft.com/office/word/2012/wordml" xmlns:w16cex="http://schemas.microsoft.com/office/word/2018/wordml/cex" xmlns:w16cid="http://schemas.microsoft.com/office/word/2016/wordml/cid" xmlns:w16="http://schemas.microsoft.com/office/word/2018/wordml" xmlns:w16du="http://schemas.microsoft.com/office/word/2023/wordml/word16du" xmlns:w16sdtdh="http://schemas.microsoft.com/office/word/2020/wordml/sdtdatahash" xmlns:w16se="http://schemas.microsoft.com/office/word/2015/wordml/symex" xmlns:wpg="http://schemas.microsoft.com/office/word/2010/wordprocessingGroup" xmlns:wpi="http://schemas.microsoft.com/office/word/2010/wordprocessingInk" xmlns:wne="http://schemas.microsoft.com/office/word/2006/wordml" xmlns:wps="http://schemas.microsoft.com/office/word/2010/wordprocessingShape" mc:Ignorable="w14 w15 w16se w16cid w16 w16cex w16sdtdh w16du wp14">
+<w:document xmlns:wpc="http://schemas.microsoft.com/office/word/2010/wordprocessingCanvas" xmlns:cx="http://schemas.microsoft.com/office/drawing/2014/chartex" xmlns:cx1="http://schemas.microsoft.com/office/drawing/2015/9/8/chartex" xmlns:cx2="http://schemas.microsoft.com/office/drawing/2015/10/21/chartex" xmlns:cx3="http://schemas.microsoft.com/office/drawing/2016/5/9/chartex" xmlns:cx4="http://schemas.microsoft.com/office/drawing/2016/5/10/chartex" xmlns:cx5="http://schemas.microsoft.com/office/drawing/2016/5/11/chartex" xmlns:cx6="http://schemas.microsoft.com/office/drawing/2016/5/12/chartex" xmlns:cx7="http://schemas.microsoft.com/office/drawing/2016/5/13/chartex" xmlns:cx8="http://schemas.microsoft.com/office/drawing/2016/5/14/chartex" xmlns:mc="http://schemas.openxmlformats.org/markup-compatibility/2006" xmlns:aink="http://schemas.microsoft.com/office/drawing/2016/ink" xmlns:am3d="http://schemas.microsoft.com/office/drawing/2017/model3d" xmlns:o="urn:schemas-microsoft-com:office:office" xmlns:oel="http://schemas.microsoft.com/office/2019/extlst" xmlns:r="http://schemas.openxmlformats.org/officeDocument/2006/relationships" xmlns:m="http://schemas.openxmlformats.org/officeDocument/2006/math" xmlns:v="urn:schemas-microsoft-com:vml" xmlns:wp14="http://schemas.microsoft.com/office/word/2010/wordprocessingDrawing" xmlns:wp="http://schemas.openxmlformats.org/drawingml/2006/wordprocessingDrawing" xmlns:w10="urn:schemas-microsoft-com:office:word" xmlns:w="http://schemas.openxmlformats.org/wordprocessingml/2006/main" xmlns:w14="http://schemas.microsoft.com/office/word/2010/wordml" xmlns:w15="http://schemas.microsoft.com/office/word/2012/wordml" xmlns:w16cex="http://schemas.microsoft.com/office/word/2018/wordml/cex" xmlns:w16cid="http://schemas.microsoft.com/office/word/2016/wordml/cid" xmlns:w16="http://schemas.microsoft.com/office/word/2018/wordml" xmlns:w16du="http://schemas.microsoft.com/office/word/2023/wordml/word16du" xmlns:w16sdtdh="http://schemas.microsoft.com/office/word/2020/wordml/sdtdatahash" xmlns:w16sdtfl="http://schemas.microsoft.com/office/word/2024/wordml/sdtformatlock" xmlns:w16se="http://schemas.microsoft.com/office/word/2015/wordml/symex" xmlns:wpg="http://schemas.microsoft.com/office/word/2010/wordprocessingGroup" xmlns:wpi="http://schemas.microsoft.com/office/word/2010/wordprocessingInk" xmlns:wne="http://schemas.microsoft.com/office/word/2006/wordml" xmlns:wps="http://schemas.microsoft.com/office/word/2010/wordprocessingShape" mc:Ignorable="w14 w15 w16se w16cid w16 w16cex w16sdtdh w16sdtfl w16du wp14">
   <w:body>
     <w:p>
       <w:pPr>
@@ -12898,11 +12898,19 @@
         </w:rPr>
         <w:t xml:space="preserve"> </w:t>
       </w:r>
+      <w:proofErr w:type="gramStart"/>
       <w:r>
         <w:rPr>
           <w:lang w:eastAsia="en-CA"/>
         </w:rPr>
-        <w:t>have more than one point in common, but their interiors do not intersect.</w:t>
+        <w:t>have</w:t>
+      </w:r>
+      <w:proofErr w:type="gramEnd"/>
+      <w:r>
+        <w:rPr>
+          <w:lang w:eastAsia="en-CA"/>
+        </w:rPr>
+        <w:t xml:space="preserve"> more than one point in common, but their interiors do not intersect.</w:t>
       </w:r>
     </w:p>
     <w:tbl>
@@ -22320,55 +22328,43 @@
         <w:rPr>
           <w:lang w:eastAsia="en-CA"/>
         </w:rPr>
-        <w:t xml:space="preserve"> </w:t>
+        <w:t xml:space="preserve"> is always the larger of the two </w:t>
       </w:r>
       <w:r>
         <w:rPr>
           <w:lang w:eastAsia="en-CA"/>
         </w:rPr>
-        <w:t xml:space="preserve">is always the larger of the two </w:t>
+        <w:t>structures,</w:t>
       </w:r>
       <w:r>
         <w:rPr>
           <w:lang w:eastAsia="en-CA"/>
         </w:rPr>
-        <w:t>structures,</w:t>
+        <w:t xml:space="preserve"> then the relationships: </w:t>
       </w:r>
       <w:r>
         <w:rPr>
           <w:lang w:eastAsia="en-CA"/>
         </w:rPr>
-        <w:t xml:space="preserve"> then the relationships: </w:t>
+        <w:t>Embeds</w:t>
       </w:r>
       <w:r>
         <w:rPr>
           <w:lang w:eastAsia="en-CA"/>
         </w:rPr>
-        <w:t>Embeds</w:t>
+        <w:t xml:space="preserve">, </w:t>
       </w:r>
       <w:r>
         <w:rPr>
           <w:lang w:eastAsia="en-CA"/>
         </w:rPr>
+        <w:t>Sheltered</w:t>
+      </w:r>
+      <w:r>
+        <w:rPr>
+          <w:lang w:eastAsia="en-CA"/>
+        </w:rPr>
         <w:t xml:space="preserve">, </w:t>
-      </w:r>
-      <w:r>
-        <w:rPr>
-          <w:lang w:eastAsia="en-CA"/>
-        </w:rPr>
-        <w:t>Sheltered</w:t>
-      </w:r>
-      <w:r>
-        <w:rPr>
-          <w:lang w:eastAsia="en-CA"/>
-        </w:rPr>
-        <w:t>,</w:t>
-      </w:r>
-      <w:r>
-        <w:rPr>
-          <w:lang w:eastAsia="en-CA"/>
-        </w:rPr>
-        <w:t xml:space="preserve"> </w:t>
       </w:r>
       <w:r>
         <w:t>Confines</w:t>
@@ -22492,13 +22488,7 @@
         <w:rPr>
           <w:lang w:eastAsia="en-CA"/>
         </w:rPr>
-        <w:t>Interior</w:t>
-      </w:r>
-      <w:r>
-        <w:rPr>
-          <w:lang w:eastAsia="en-CA"/>
-        </w:rPr>
-        <w:t xml:space="preserve"> </w:t>
+        <w:t xml:space="preserve">Interior </w:t>
       </w:r>
       <w:r>
         <w:rPr>
@@ -28253,7 +28243,6 @@
               <w:bottom w:val="single" w:sz="18" w:space="0" w:color="auto"/>
               <w:right w:val="nil"/>
             </w:tcBorders>
-            <w:shd w:val="clear" w:color="auto" w:fill="auto"/>
             <w:noWrap/>
             <w:vAlign w:val="center"/>
             <w:hideMark/>
@@ -28300,7 +28289,6 @@
               <w:bottom w:val="single" w:sz="18" w:space="0" w:color="auto"/>
               <w:right w:val="single" w:sz="18" w:space="0" w:color="auto"/>
             </w:tcBorders>
-            <w:shd w:val="clear" w:color="auto" w:fill="auto"/>
             <w:noWrap/>
             <w:vAlign w:val="center"/>
             <w:hideMark/>
@@ -28349,7 +28337,6 @@
               <w:bottom w:val="single" w:sz="8" w:space="0" w:color="000000"/>
               <w:right w:val="nil"/>
             </w:tcBorders>
-            <w:shd w:val="clear" w:color="auto" w:fill="auto"/>
             <w:noWrap/>
             <w:vAlign w:val="center"/>
             <w:hideMark/>
@@ -28383,7 +28370,6 @@
               <w:bottom w:val="nil"/>
               <w:right w:val="nil"/>
             </w:tcBorders>
-            <w:shd w:val="clear" w:color="auto" w:fill="auto"/>
             <w:noWrap/>
             <w:vAlign w:val="center"/>
             <w:hideMark/>
@@ -28426,7 +28412,6 @@
               <w:bottom w:val="nil"/>
               <w:right w:val="single" w:sz="18" w:space="0" w:color="auto"/>
             </w:tcBorders>
-            <w:shd w:val="clear" w:color="auto" w:fill="auto"/>
             <w:noWrap/>
             <w:vAlign w:val="center"/>
             <w:hideMark/>
@@ -28489,7 +28474,6 @@
               <w:bottom w:val="single" w:sz="18" w:space="0" w:color="auto"/>
               <w:right w:val="nil"/>
             </w:tcBorders>
-            <w:shd w:val="clear" w:color="auto" w:fill="auto"/>
             <w:noWrap/>
             <w:vAlign w:val="center"/>
             <w:hideMark/>
@@ -28532,7 +28516,6 @@
               <w:bottom w:val="single" w:sz="18" w:space="0" w:color="auto"/>
               <w:right w:val="single" w:sz="18" w:space="0" w:color="auto"/>
             </w:tcBorders>
-            <w:shd w:val="clear" w:color="auto" w:fill="auto"/>
             <w:noWrap/>
             <w:vAlign w:val="center"/>
             <w:hideMark/>
@@ -28570,7 +28553,6 @@
               <w:bottom w:val="single" w:sz="8" w:space="0" w:color="000000"/>
               <w:right w:val="nil"/>
             </w:tcBorders>
-            <w:shd w:val="clear" w:color="auto" w:fill="auto"/>
             <w:noWrap/>
             <w:vAlign w:val="center"/>
             <w:hideMark/>
@@ -28604,7 +28586,6 @@
               <w:bottom w:val="nil"/>
               <w:right w:val="nil"/>
             </w:tcBorders>
-            <w:shd w:val="clear" w:color="auto" w:fill="auto"/>
             <w:noWrap/>
             <w:vAlign w:val="center"/>
             <w:hideMark/>
@@ -28647,7 +28628,6 @@
               <w:bottom w:val="nil"/>
               <w:right w:val="single" w:sz="18" w:space="0" w:color="auto"/>
             </w:tcBorders>
-            <w:shd w:val="clear" w:color="auto" w:fill="auto"/>
             <w:noWrap/>
             <w:vAlign w:val="center"/>
             <w:hideMark/>
@@ -28710,7 +28690,6 @@
               <w:bottom w:val="single" w:sz="8" w:space="0" w:color="auto"/>
               <w:right w:val="nil"/>
             </w:tcBorders>
-            <w:shd w:val="clear" w:color="auto" w:fill="auto"/>
             <w:noWrap/>
             <w:vAlign w:val="center"/>
             <w:hideMark/>
@@ -28753,7 +28732,6 @@
               <w:bottom w:val="single" w:sz="8" w:space="0" w:color="auto"/>
               <w:right w:val="single" w:sz="18" w:space="0" w:color="auto"/>
             </w:tcBorders>
-            <w:shd w:val="clear" w:color="auto" w:fill="auto"/>
             <w:noWrap/>
             <w:vAlign w:val="center"/>
             <w:hideMark/>
@@ -28791,7 +28769,6 @@
               <w:bottom w:val="single" w:sz="8" w:space="0" w:color="000000"/>
               <w:right w:val="nil"/>
             </w:tcBorders>
-            <w:shd w:val="clear" w:color="auto" w:fill="auto"/>
             <w:noWrap/>
             <w:vAlign w:val="center"/>
             <w:hideMark/>
@@ -28825,7 +28802,6 @@
               <w:bottom w:val="nil"/>
               <w:right w:val="nil"/>
             </w:tcBorders>
-            <w:shd w:val="clear" w:color="auto" w:fill="auto"/>
             <w:noWrap/>
             <w:vAlign w:val="center"/>
             <w:hideMark/>
@@ -28868,7 +28844,6 @@
               <w:bottom w:val="nil"/>
               <w:right w:val="single" w:sz="18" w:space="0" w:color="auto"/>
             </w:tcBorders>
-            <w:shd w:val="clear" w:color="auto" w:fill="auto"/>
             <w:noWrap/>
             <w:vAlign w:val="center"/>
             <w:hideMark/>
@@ -28931,7 +28906,6 @@
               <w:bottom w:val="single" w:sz="18" w:space="0" w:color="auto"/>
               <w:right w:val="nil"/>
             </w:tcBorders>
-            <w:shd w:val="clear" w:color="auto" w:fill="auto"/>
             <w:noWrap/>
             <w:vAlign w:val="center"/>
             <w:hideMark/>
@@ -28974,7 +28948,6 @@
               <w:bottom w:val="single" w:sz="18" w:space="0" w:color="auto"/>
               <w:right w:val="single" w:sz="18" w:space="0" w:color="auto"/>
             </w:tcBorders>
-            <w:shd w:val="clear" w:color="auto" w:fill="auto"/>
             <w:noWrap/>
             <w:vAlign w:val="center"/>
             <w:hideMark/>
@@ -29012,7 +28985,6 @@
               <w:bottom w:val="single" w:sz="8" w:space="0" w:color="000000"/>
               <w:right w:val="nil"/>
             </w:tcBorders>
-            <w:shd w:val="clear" w:color="auto" w:fill="auto"/>
             <w:noWrap/>
             <w:vAlign w:val="center"/>
             <w:hideMark/>
@@ -29046,7 +29018,6 @@
               <w:bottom w:val="nil"/>
               <w:right w:val="nil"/>
             </w:tcBorders>
-            <w:shd w:val="clear" w:color="auto" w:fill="auto"/>
             <w:noWrap/>
             <w:vAlign w:val="center"/>
             <w:hideMark/>
@@ -29089,7 +29060,6 @@
               <w:bottom w:val="nil"/>
               <w:right w:val="single" w:sz="18" w:space="0" w:color="auto"/>
             </w:tcBorders>
-            <w:shd w:val="clear" w:color="auto" w:fill="auto"/>
             <w:noWrap/>
             <w:vAlign w:val="center"/>
             <w:hideMark/>
@@ -29152,7 +29122,6 @@
               <w:bottom w:val="single" w:sz="8" w:space="0" w:color="auto"/>
               <w:right w:val="nil"/>
             </w:tcBorders>
-            <w:shd w:val="clear" w:color="auto" w:fill="auto"/>
             <w:noWrap/>
             <w:vAlign w:val="center"/>
             <w:hideMark/>
@@ -29195,7 +29164,6 @@
               <w:bottom w:val="single" w:sz="8" w:space="0" w:color="auto"/>
               <w:right w:val="single" w:sz="18" w:space="0" w:color="auto"/>
             </w:tcBorders>
-            <w:shd w:val="clear" w:color="auto" w:fill="auto"/>
             <w:noWrap/>
             <w:vAlign w:val="center"/>
             <w:hideMark/>
@@ -29233,7 +29201,6 @@
               <w:bottom w:val="single" w:sz="8" w:space="0" w:color="000000"/>
               <w:right w:val="nil"/>
             </w:tcBorders>
-            <w:shd w:val="clear" w:color="auto" w:fill="auto"/>
             <w:noWrap/>
             <w:vAlign w:val="center"/>
             <w:hideMark/>
@@ -29267,7 +29234,6 @@
               <w:bottom w:val="nil"/>
               <w:right w:val="nil"/>
             </w:tcBorders>
-            <w:shd w:val="clear" w:color="auto" w:fill="auto"/>
             <w:noWrap/>
             <w:vAlign w:val="center"/>
             <w:hideMark/>
@@ -29310,7 +29276,6 @@
               <w:bottom w:val="nil"/>
               <w:right w:val="single" w:sz="18" w:space="0" w:color="auto"/>
             </w:tcBorders>
-            <w:shd w:val="clear" w:color="auto" w:fill="auto"/>
             <w:noWrap/>
             <w:vAlign w:val="center"/>
             <w:hideMark/>
@@ -29373,7 +29338,6 @@
               <w:bottom w:val="single" w:sz="18" w:space="0" w:color="auto"/>
               <w:right w:val="nil"/>
             </w:tcBorders>
-            <w:shd w:val="clear" w:color="auto" w:fill="auto"/>
             <w:noWrap/>
             <w:vAlign w:val="center"/>
             <w:hideMark/>
@@ -29416,7 +29380,6 @@
               <w:bottom w:val="single" w:sz="18" w:space="0" w:color="auto"/>
               <w:right w:val="single" w:sz="18" w:space="0" w:color="auto"/>
             </w:tcBorders>
-            <w:shd w:val="clear" w:color="auto" w:fill="auto"/>
             <w:noWrap/>
             <w:vAlign w:val="center"/>
             <w:hideMark/>
@@ -29454,7 +29417,6 @@
               <w:bottom w:val="single" w:sz="8" w:space="0" w:color="000000"/>
               <w:right w:val="nil"/>
             </w:tcBorders>
-            <w:shd w:val="clear" w:color="auto" w:fill="auto"/>
             <w:noWrap/>
             <w:vAlign w:val="center"/>
             <w:hideMark/>
@@ -29488,7 +29450,6 @@
               <w:bottom w:val="nil"/>
               <w:right w:val="nil"/>
             </w:tcBorders>
-            <w:shd w:val="clear" w:color="auto" w:fill="auto"/>
             <w:noWrap/>
             <w:vAlign w:val="center"/>
             <w:hideMark/>
@@ -29531,7 +29492,6 @@
               <w:bottom w:val="nil"/>
               <w:right w:val="single" w:sz="18" w:space="0" w:color="auto"/>
             </w:tcBorders>
-            <w:shd w:val="clear" w:color="auto" w:fill="auto"/>
             <w:noWrap/>
             <w:vAlign w:val="center"/>
             <w:hideMark/>
@@ -29594,7 +29554,6 @@
               <w:bottom w:val="single" w:sz="18" w:space="0" w:color="auto"/>
               <w:right w:val="nil"/>
             </w:tcBorders>
-            <w:shd w:val="clear" w:color="auto" w:fill="auto"/>
             <w:noWrap/>
             <w:vAlign w:val="center"/>
             <w:hideMark/>
@@ -29637,7 +29596,6 @@
               <w:bottom w:val="single" w:sz="18" w:space="0" w:color="auto"/>
               <w:right w:val="single" w:sz="18" w:space="0" w:color="auto"/>
             </w:tcBorders>
-            <w:shd w:val="clear" w:color="auto" w:fill="auto"/>
             <w:noWrap/>
             <w:vAlign w:val="center"/>
             <w:hideMark/>
@@ -29675,7 +29633,6 @@
               <w:bottom w:val="dotted" w:sz="2" w:space="0" w:color="auto"/>
               <w:right w:val="nil"/>
             </w:tcBorders>
-            <w:shd w:val="clear" w:color="auto" w:fill="auto"/>
             <w:noWrap/>
             <w:vAlign w:val="center"/>
             <w:hideMark/>
@@ -29709,7 +29666,6 @@
               <w:bottom w:val="dotted" w:sz="2" w:space="0" w:color="auto"/>
               <w:right w:val="nil"/>
             </w:tcBorders>
-            <w:shd w:val="clear" w:color="auto" w:fill="auto"/>
             <w:noWrap/>
             <w:vAlign w:val="center"/>
             <w:hideMark/>
@@ -29752,7 +29708,6 @@
               <w:bottom w:val="dotted" w:sz="2" w:space="0" w:color="auto"/>
               <w:right w:val="single" w:sz="18" w:space="0" w:color="auto"/>
             </w:tcBorders>
-            <w:shd w:val="clear" w:color="auto" w:fill="auto"/>
             <w:noWrap/>
             <w:vAlign w:val="center"/>
             <w:hideMark/>
@@ -29815,7 +29770,6 @@
               <w:bottom w:val="single" w:sz="4" w:space="0" w:color="auto"/>
               <w:right w:val="nil"/>
             </w:tcBorders>
-            <w:shd w:val="clear" w:color="auto" w:fill="auto"/>
             <w:noWrap/>
             <w:vAlign w:val="center"/>
             <w:hideMark/>
@@ -29858,7 +29812,6 @@
               <w:bottom w:val="single" w:sz="4" w:space="0" w:color="auto"/>
               <w:right w:val="single" w:sz="18" w:space="0" w:color="auto"/>
             </w:tcBorders>
-            <w:shd w:val="clear" w:color="auto" w:fill="auto"/>
             <w:noWrap/>
             <w:vAlign w:val="center"/>
             <w:hideMark/>
@@ -29896,7 +29849,6 @@
               <w:bottom w:val="dotted" w:sz="2" w:space="0" w:color="auto"/>
               <w:right w:val="nil"/>
             </w:tcBorders>
-            <w:shd w:val="clear" w:color="auto" w:fill="auto"/>
             <w:noWrap/>
             <w:vAlign w:val="center"/>
             <w:hideMark/>
@@ -29930,7 +29882,6 @@
               <w:bottom w:val="dotted" w:sz="2" w:space="0" w:color="auto"/>
               <w:right w:val="nil"/>
             </w:tcBorders>
-            <w:shd w:val="clear" w:color="auto" w:fill="auto"/>
             <w:noWrap/>
             <w:vAlign w:val="center"/>
             <w:hideMark/>
@@ -29973,7 +29924,6 @@
               <w:bottom w:val="dotted" w:sz="2" w:space="0" w:color="auto"/>
               <w:right w:val="single" w:sz="18" w:space="0" w:color="auto"/>
             </w:tcBorders>
-            <w:shd w:val="clear" w:color="auto" w:fill="auto"/>
             <w:noWrap/>
             <w:vAlign w:val="center"/>
             <w:hideMark/>
@@ -30036,7 +29986,6 @@
               <w:bottom w:val="single" w:sz="18" w:space="0" w:color="auto"/>
               <w:right w:val="nil"/>
             </w:tcBorders>
-            <w:shd w:val="clear" w:color="auto" w:fill="auto"/>
             <w:noWrap/>
             <w:vAlign w:val="center"/>
             <w:hideMark/>
@@ -30079,7 +30028,6 @@
               <w:bottom w:val="single" w:sz="18" w:space="0" w:color="auto"/>
               <w:right w:val="single" w:sz="18" w:space="0" w:color="auto"/>
             </w:tcBorders>
-            <w:shd w:val="clear" w:color="auto" w:fill="auto"/>
             <w:noWrap/>
             <w:vAlign w:val="center"/>
             <w:hideMark/>
@@ -30117,7 +30065,6 @@
               <w:bottom w:val="single" w:sz="8" w:space="0" w:color="000000"/>
               <w:right w:val="nil"/>
             </w:tcBorders>
-            <w:shd w:val="clear" w:color="auto" w:fill="auto"/>
             <w:noWrap/>
             <w:vAlign w:val="center"/>
             <w:hideMark/>
@@ -30151,7 +30098,6 @@
               <w:bottom w:val="nil"/>
               <w:right w:val="nil"/>
             </w:tcBorders>
-            <w:shd w:val="clear" w:color="auto" w:fill="auto"/>
             <w:noWrap/>
             <w:vAlign w:val="center"/>
             <w:hideMark/>
@@ -30194,7 +30140,6 @@
               <w:bottom w:val="nil"/>
               <w:right w:val="single" w:sz="18" w:space="0" w:color="auto"/>
             </w:tcBorders>
-            <w:shd w:val="clear" w:color="auto" w:fill="auto"/>
             <w:noWrap/>
             <w:vAlign w:val="center"/>
             <w:hideMark/>
@@ -30257,7 +30202,6 @@
               <w:bottom w:val="single" w:sz="8" w:space="0" w:color="auto"/>
               <w:right w:val="nil"/>
             </w:tcBorders>
-            <w:shd w:val="clear" w:color="auto" w:fill="auto"/>
             <w:noWrap/>
             <w:vAlign w:val="center"/>
             <w:hideMark/>
@@ -30300,7 +30244,6 @@
               <w:bottom w:val="single" w:sz="8" w:space="0" w:color="auto"/>
               <w:right w:val="single" w:sz="18" w:space="0" w:color="auto"/>
             </w:tcBorders>
-            <w:shd w:val="clear" w:color="auto" w:fill="auto"/>
             <w:noWrap/>
             <w:vAlign w:val="center"/>
             <w:hideMark/>
@@ -30338,7 +30281,6 @@
               <w:bottom w:val="single" w:sz="8" w:space="0" w:color="000000"/>
               <w:right w:val="nil"/>
             </w:tcBorders>
-            <w:shd w:val="clear" w:color="auto" w:fill="auto"/>
             <w:noWrap/>
             <w:vAlign w:val="center"/>
             <w:hideMark/>
@@ -30372,7 +30314,6 @@
               <w:bottom w:val="nil"/>
               <w:right w:val="nil"/>
             </w:tcBorders>
-            <w:shd w:val="clear" w:color="auto" w:fill="auto"/>
             <w:noWrap/>
             <w:vAlign w:val="center"/>
             <w:hideMark/>
@@ -30415,7 +30356,6 @@
               <w:bottom w:val="nil"/>
               <w:right w:val="single" w:sz="18" w:space="0" w:color="auto"/>
             </w:tcBorders>
-            <w:shd w:val="clear" w:color="auto" w:fill="auto"/>
             <w:noWrap/>
             <w:vAlign w:val="center"/>
             <w:hideMark/>
@@ -30478,7 +30418,6 @@
               <w:bottom w:val="single" w:sz="18" w:space="0" w:color="auto"/>
               <w:right w:val="nil"/>
             </w:tcBorders>
-            <w:shd w:val="clear" w:color="auto" w:fill="auto"/>
             <w:noWrap/>
             <w:vAlign w:val="center"/>
             <w:hideMark/>
@@ -30521,7 +30460,6 @@
               <w:bottom w:val="single" w:sz="18" w:space="0" w:color="auto"/>
               <w:right w:val="single" w:sz="18" w:space="0" w:color="auto"/>
             </w:tcBorders>
-            <w:shd w:val="clear" w:color="auto" w:fill="auto"/>
             <w:noWrap/>
             <w:vAlign w:val="center"/>
             <w:hideMark/>
@@ -30559,7 +30497,6 @@
               <w:bottom w:val="single" w:sz="8" w:space="0" w:color="000000"/>
               <w:right w:val="nil"/>
             </w:tcBorders>
-            <w:shd w:val="clear" w:color="auto" w:fill="auto"/>
             <w:noWrap/>
             <w:vAlign w:val="center"/>
             <w:hideMark/>
@@ -30593,7 +30530,6 @@
               <w:bottom w:val="nil"/>
               <w:right w:val="nil"/>
             </w:tcBorders>
-            <w:shd w:val="clear" w:color="auto" w:fill="auto"/>
             <w:noWrap/>
             <w:vAlign w:val="center"/>
             <w:hideMark/>
@@ -30636,7 +30572,6 @@
               <w:bottom w:val="nil"/>
               <w:right w:val="single" w:sz="18" w:space="0" w:color="auto"/>
             </w:tcBorders>
-            <w:shd w:val="clear" w:color="auto" w:fill="auto"/>
             <w:noWrap/>
             <w:vAlign w:val="center"/>
             <w:hideMark/>
@@ -30699,7 +30634,6 @@
               <w:bottom w:val="single" w:sz="8" w:space="0" w:color="auto"/>
               <w:right w:val="nil"/>
             </w:tcBorders>
-            <w:shd w:val="clear" w:color="auto" w:fill="auto"/>
             <w:noWrap/>
             <w:vAlign w:val="center"/>
             <w:hideMark/>
@@ -30742,7 +30676,6 @@
               <w:bottom w:val="single" w:sz="8" w:space="0" w:color="auto"/>
               <w:right w:val="single" w:sz="18" w:space="0" w:color="auto"/>
             </w:tcBorders>
-            <w:shd w:val="clear" w:color="auto" w:fill="auto"/>
             <w:noWrap/>
             <w:vAlign w:val="center"/>
             <w:hideMark/>
@@ -30780,7 +30713,6 @@
               <w:bottom w:val="single" w:sz="8" w:space="0" w:color="000000"/>
               <w:right w:val="nil"/>
             </w:tcBorders>
-            <w:shd w:val="clear" w:color="auto" w:fill="auto"/>
             <w:noWrap/>
             <w:vAlign w:val="center"/>
             <w:hideMark/>
@@ -30814,7 +30746,6 @@
               <w:bottom w:val="nil"/>
               <w:right w:val="nil"/>
             </w:tcBorders>
-            <w:shd w:val="clear" w:color="auto" w:fill="auto"/>
             <w:noWrap/>
             <w:vAlign w:val="center"/>
             <w:hideMark/>
@@ -30857,7 +30788,6 @@
               <w:bottom w:val="nil"/>
               <w:right w:val="single" w:sz="18" w:space="0" w:color="auto"/>
             </w:tcBorders>
-            <w:shd w:val="clear" w:color="auto" w:fill="auto"/>
             <w:noWrap/>
             <w:vAlign w:val="center"/>
             <w:hideMark/>
@@ -30920,7 +30850,6 @@
               <w:bottom w:val="single" w:sz="18" w:space="0" w:color="auto"/>
               <w:right w:val="nil"/>
             </w:tcBorders>
-            <w:shd w:val="clear" w:color="auto" w:fill="auto"/>
             <w:noWrap/>
             <w:vAlign w:val="center"/>
             <w:hideMark/>
@@ -30963,7 +30892,6 @@
               <w:bottom w:val="single" w:sz="18" w:space="0" w:color="auto"/>
               <w:right w:val="single" w:sz="18" w:space="0" w:color="auto"/>
             </w:tcBorders>
-            <w:shd w:val="clear" w:color="auto" w:fill="auto"/>
             <w:noWrap/>
             <w:vAlign w:val="center"/>
             <w:hideMark/>
@@ -31001,7 +30929,6 @@
               <w:bottom w:val="single" w:sz="8" w:space="0" w:color="000000"/>
               <w:right w:val="nil"/>
             </w:tcBorders>
-            <w:shd w:val="clear" w:color="auto" w:fill="auto"/>
             <w:noWrap/>
             <w:vAlign w:val="center"/>
             <w:hideMark/>
@@ -31035,7 +30962,6 @@
               <w:bottom w:val="nil"/>
               <w:right w:val="nil"/>
             </w:tcBorders>
-            <w:shd w:val="clear" w:color="auto" w:fill="auto"/>
             <w:noWrap/>
             <w:vAlign w:val="center"/>
             <w:hideMark/>
@@ -31078,7 +31004,6 @@
               <w:bottom w:val="nil"/>
               <w:right w:val="single" w:sz="18" w:space="0" w:color="auto"/>
             </w:tcBorders>
-            <w:shd w:val="clear" w:color="auto" w:fill="auto"/>
             <w:noWrap/>
             <w:vAlign w:val="center"/>
             <w:hideMark/>
@@ -31141,7 +31066,6 @@
               <w:bottom w:val="nil"/>
               <w:right w:val="nil"/>
             </w:tcBorders>
-            <w:shd w:val="clear" w:color="auto" w:fill="auto"/>
             <w:noWrap/>
             <w:vAlign w:val="center"/>
             <w:hideMark/>
@@ -31184,7 +31108,6 @@
               <w:bottom w:val="nil"/>
               <w:right w:val="single" w:sz="18" w:space="0" w:color="auto"/>
             </w:tcBorders>
-            <w:shd w:val="clear" w:color="auto" w:fill="auto"/>
             <w:noWrap/>
             <w:vAlign w:val="center"/>
             <w:hideMark/>
@@ -31222,7 +31145,6 @@
               <w:bottom w:val="single" w:sz="8" w:space="0" w:color="000000"/>
               <w:right w:val="nil"/>
             </w:tcBorders>
-            <w:shd w:val="clear" w:color="auto" w:fill="auto"/>
             <w:noWrap/>
             <w:vAlign w:val="center"/>
             <w:hideMark/>
@@ -31255,7 +31177,6 @@
               <w:bottom w:val="nil"/>
               <w:right w:val="nil"/>
             </w:tcBorders>
-            <w:shd w:val="clear" w:color="auto" w:fill="auto"/>
             <w:noWrap/>
             <w:vAlign w:val="center"/>
             <w:hideMark/>
@@ -31298,7 +31219,6 @@
               <w:bottom w:val="nil"/>
               <w:right w:val="single" w:sz="18" w:space="0" w:color="auto"/>
             </w:tcBorders>
-            <w:shd w:val="clear" w:color="auto" w:fill="auto"/>
             <w:noWrap/>
             <w:vAlign w:val="center"/>
             <w:hideMark/>
@@ -31379,7 +31299,6 @@
               <w:bottom w:val="single" w:sz="18" w:space="0" w:color="auto"/>
               <w:right w:val="nil"/>
             </w:tcBorders>
-            <w:shd w:val="clear" w:color="auto" w:fill="auto"/>
             <w:noWrap/>
             <w:vAlign w:val="center"/>
             <w:hideMark/>
@@ -31422,7 +31341,6 @@
               <w:bottom w:val="single" w:sz="18" w:space="0" w:color="auto"/>
               <w:right w:val="single" w:sz="18" w:space="0" w:color="auto"/>
             </w:tcBorders>
-            <w:shd w:val="clear" w:color="auto" w:fill="auto"/>
             <w:noWrap/>
             <w:vAlign w:val="center"/>
             <w:hideMark/>
@@ -38565,7 +38483,7 @@
 </file>
 
 <file path=word/numbering.xml><?xml version="1.0" encoding="utf-8"?>
-<w:numbering xmlns:wpc="http://schemas.microsoft.com/office/word/2010/wordprocessingCanvas" xmlns:cx="http://schemas.microsoft.com/office/drawing/2014/chartex" xmlns:cx1="http://schemas.microsoft.com/office/drawing/2015/9/8/chartex" xmlns:cx2="http://schemas.microsoft.com/office/drawing/2015/10/21/chartex" xmlns:cx3="http://schemas.microsoft.com/office/drawing/2016/5/9/chartex" xmlns:cx4="http://schemas.microsoft.com/office/drawing/2016/5/10/chartex" xmlns:cx5="http://schemas.microsoft.com/office/drawing/2016/5/11/chartex" xmlns:cx6="http://schemas.microsoft.com/office/drawing/2016/5/12/chartex" xmlns:cx7="http://schemas.microsoft.com/office/drawing/2016/5/13/chartex" xmlns:cx8="http://schemas.microsoft.com/office/drawing/2016/5/14/chartex" xmlns:mc="http://schemas.openxmlformats.org/markup-compatibility/2006" xmlns:aink="http://schemas.microsoft.com/office/drawing/2016/ink" xmlns:am3d="http://schemas.microsoft.com/office/drawing/2017/model3d" xmlns:o="urn:schemas-microsoft-com:office:office" xmlns:oel="http://schemas.microsoft.com/office/2019/extlst" xmlns:r="http://schemas.openxmlformats.org/officeDocument/2006/relationships" xmlns:m="http://schemas.openxmlformats.org/officeDocument/2006/math" xmlns:v="urn:schemas-microsoft-com:vml" xmlns:wp14="http://schemas.microsoft.com/office/word/2010/wordprocessingDrawing" xmlns:wp="http://schemas.openxmlformats.org/drawingml/2006/wordprocessingDrawing" xmlns:w10="urn:schemas-microsoft-com:office:word" xmlns:w="http://schemas.openxmlformats.org/wordprocessingml/2006/main" xmlns:w14="http://schemas.microsoft.com/office/word/2010/wordml" xmlns:w15="http://schemas.microsoft.com/office/word/2012/wordml" xmlns:w16cex="http://schemas.microsoft.com/office/word/2018/wordml/cex" xmlns:w16cid="http://schemas.microsoft.com/office/word/2016/wordml/cid" xmlns:w16="http://schemas.microsoft.com/office/word/2018/wordml" xmlns:w16du="http://schemas.microsoft.com/office/word/2023/wordml/word16du" xmlns:w16sdtdh="http://schemas.microsoft.com/office/word/2020/wordml/sdtdatahash" xmlns:w16se="http://schemas.microsoft.com/office/word/2015/wordml/symex" xmlns:wpg="http://schemas.microsoft.com/office/word/2010/wordprocessingGroup" xmlns:wpi="http://schemas.microsoft.com/office/word/2010/wordprocessingInk" xmlns:wne="http://schemas.microsoft.com/office/word/2006/wordml" xmlns:wps="http://schemas.microsoft.com/office/word/2010/wordprocessingShape" mc:Ignorable="w14 w15 w16se w16cid w16 w16cex w16sdtdh w16du wp14">
+<w:numbering xmlns:wpc="http://schemas.microsoft.com/office/word/2010/wordprocessingCanvas" xmlns:cx="http://schemas.microsoft.com/office/drawing/2014/chartex" xmlns:cx1="http://schemas.microsoft.com/office/drawing/2015/9/8/chartex" xmlns:cx2="http://schemas.microsoft.com/office/drawing/2015/10/21/chartex" xmlns:cx3="http://schemas.microsoft.com/office/drawing/2016/5/9/chartex" xmlns:cx4="http://schemas.microsoft.com/office/drawing/2016/5/10/chartex" xmlns:cx5="http://schemas.microsoft.com/office/drawing/2016/5/11/chartex" xmlns:cx6="http://schemas.microsoft.com/office/drawing/2016/5/12/chartex" xmlns:cx7="http://schemas.microsoft.com/office/drawing/2016/5/13/chartex" xmlns:cx8="http://schemas.microsoft.com/office/drawing/2016/5/14/chartex" xmlns:mc="http://schemas.openxmlformats.org/markup-compatibility/2006" xmlns:aink="http://schemas.microsoft.com/office/drawing/2016/ink" xmlns:am3d="http://schemas.microsoft.com/office/drawing/2017/model3d" xmlns:o="urn:schemas-microsoft-com:office:office" xmlns:oel="http://schemas.microsoft.com/office/2019/extlst" xmlns:r="http://schemas.openxmlformats.org/officeDocument/2006/relationships" xmlns:m="http://schemas.openxmlformats.org/officeDocument/2006/math" xmlns:v="urn:schemas-microsoft-com:vml" xmlns:wp14="http://schemas.microsoft.com/office/word/2010/wordprocessingDrawing" xmlns:wp="http://schemas.openxmlformats.org/drawingml/2006/wordprocessingDrawing" xmlns:w10="urn:schemas-microsoft-com:office:word" xmlns:w="http://schemas.openxmlformats.org/wordprocessingml/2006/main" xmlns:w14="http://schemas.microsoft.com/office/word/2010/wordml" xmlns:w15="http://schemas.microsoft.com/office/word/2012/wordml" xmlns:w16cex="http://schemas.microsoft.com/office/word/2018/wordml/cex" xmlns:w16cid="http://schemas.microsoft.com/office/word/2016/wordml/cid" xmlns:w16="http://schemas.microsoft.com/office/word/2018/wordml" xmlns:w16du="http://schemas.microsoft.com/office/word/2023/wordml/word16du" xmlns:w16sdtdh="http://schemas.microsoft.com/office/word/2020/wordml/sdtdatahash" xmlns:w16sdtfl="http://schemas.microsoft.com/office/word/2024/wordml/sdtformatlock" xmlns:w16se="http://schemas.microsoft.com/office/word/2015/wordml/symex" xmlns:wpg="http://schemas.microsoft.com/office/word/2010/wordprocessingGroup" xmlns:wpi="http://schemas.microsoft.com/office/word/2010/wordprocessingInk" xmlns:wne="http://schemas.microsoft.com/office/word/2006/wordml" xmlns:wps="http://schemas.microsoft.com/office/word/2010/wordprocessingShape" mc:Ignorable="w14 w15 w16se w16cid w16 w16cex w16sdtdh w16sdtfl w16du wp14">
   <w:abstractNum w:abstractNumId="0" w15:restartNumberingAfterBreak="0">
     <w:nsid w:val="034C3298"/>
     <w:multiLevelType w:val="hybridMultilevel"/>
@@ -40044,7 +39962,7 @@
 </file>
 
 <file path=word/styles.xml><?xml version="1.0" encoding="utf-8"?>
-<w:styles xmlns:mc="http://schemas.openxmlformats.org/markup-compatibility/2006" xmlns:r="http://schemas.openxmlformats.org/officeDocument/2006/relationships" xmlns:w="http://schemas.openxmlformats.org/wordprocessingml/2006/main" xmlns:w14="http://schemas.microsoft.com/office/word/2010/wordml" xmlns:w15="http://schemas.microsoft.com/office/word/2012/wordml" xmlns:w16cex="http://schemas.microsoft.com/office/word/2018/wordml/cex" xmlns:w16cid="http://schemas.microsoft.com/office/word/2016/wordml/cid" xmlns:w16="http://schemas.microsoft.com/office/word/2018/wordml" xmlns:w16du="http://schemas.microsoft.com/office/word/2023/wordml/word16du" xmlns:w16sdtdh="http://schemas.microsoft.com/office/word/2020/wordml/sdtdatahash" xmlns:w16se="http://schemas.microsoft.com/office/word/2015/wordml/symex" mc:Ignorable="w14 w15 w16se w16cid w16 w16cex w16sdtdh w16du">
+<w:styles xmlns:mc="http://schemas.openxmlformats.org/markup-compatibility/2006" xmlns:r="http://schemas.openxmlformats.org/officeDocument/2006/relationships" xmlns:w="http://schemas.openxmlformats.org/wordprocessingml/2006/main" xmlns:w14="http://schemas.microsoft.com/office/word/2010/wordml" xmlns:w15="http://schemas.microsoft.com/office/word/2012/wordml" xmlns:w16cex="http://schemas.microsoft.com/office/word/2018/wordml/cex" xmlns:w16cid="http://schemas.microsoft.com/office/word/2016/wordml/cid" xmlns:w16="http://schemas.microsoft.com/office/word/2018/wordml" xmlns:w16du="http://schemas.microsoft.com/office/word/2023/wordml/word16du" xmlns:w16sdtdh="http://schemas.microsoft.com/office/word/2020/wordml/sdtdatahash" xmlns:w16sdtfl="http://schemas.microsoft.com/office/word/2024/wordml/sdtformatlock" xmlns:w16se="http://schemas.microsoft.com/office/word/2015/wordml/symex" mc:Ignorable="w14 w15 w16se w16cid w16 w16cex w16sdtdh w16sdtfl w16du">
   <w:docDefaults>
     <w:rPrDefault>
       <w:rPr>
@@ -40650,6 +40568,7 @@
   <w:style w:type="character" w:default="1" w:styleId="DefaultParagraphFont">
     <w:name w:val="Default Paragraph Font"/>
     <w:uiPriority w:val="1"/>
+    <w:semiHidden/>
     <w:unhideWhenUsed/>
   </w:style>
   <w:style w:type="table" w:default="1" w:styleId="TableNormal">

</xml_diff>

<commit_message>
Cleaned up Webapp tests
</commit_message>
<xml_diff>
--- a/docs/Shapes and Relations in 2D.docx
+++ b/docs/Shapes and Relations in 2D.docx
@@ -34831,7 +34831,1273 @@
       </w:tr>
     </w:tbl>
     <w:p/>
-    <w:p/>
+    <w:p>
+      <w:pPr>
+        <w:pStyle w:val="Heading3"/>
+        <w:rPr>
+          <w:rFonts w:asciiTheme="majorHAnsi" w:eastAsia="Times New Roman" w:hAnsiTheme="majorHAnsi"/>
+          <w:b/>
+          <w:bCs/>
+          <w:color w:val="auto"/>
+          <w:lang w:eastAsia="en-CA"/>
+        </w:rPr>
+      </w:pPr>
+      <w:r>
+        <w:rPr>
+          <w:rFonts w:asciiTheme="majorHAnsi" w:eastAsia="Times New Roman" w:hAnsiTheme="majorHAnsi"/>
+          <w:b/>
+          <w:bCs/>
+          <w:color w:val="auto"/>
+          <w:lang w:eastAsia="en-CA"/>
+        </w:rPr>
+        <w:t>Logical</w:t>
+      </w:r>
+      <w:r>
+        <w:rPr>
+          <w:rFonts w:asciiTheme="majorHAnsi" w:eastAsia="Times New Roman" w:hAnsiTheme="majorHAnsi"/>
+          <w:b/>
+          <w:bCs/>
+          <w:color w:val="auto"/>
+          <w:lang w:eastAsia="en-CA"/>
+        </w:rPr>
+        <w:t xml:space="preserve"> Relationships</w:t>
+      </w:r>
+    </w:p>
+    <w:p>
+      <w:pPr>
+        <w:rPr>
+          <w:rFonts w:ascii="Aptos" w:hAnsi="Aptos" w:cs="Calibri"/>
+          <w:color w:val="000000"/>
+          <w:shd w:val="clear" w:color="auto" w:fill="FFFFFF"/>
+        </w:rPr>
+      </w:pPr>
+      <w:r>
+        <w:t xml:space="preserve">Within a set of structures, transitive relationships can result in </w:t>
+      </w:r>
+      <w:r>
+        <w:rPr>
+          <w:b/>
+          <w:bCs/>
+        </w:rPr>
+        <w:t>Logical</w:t>
+      </w:r>
+      <w:r>
+        <w:t xml:space="preserve"> relationships, which exists out of necessity due to other relationships in the structure set. The simplest example is one where </w:t>
+      </w:r>
+      <w:r>
+        <w:rPr>
+          <w:rFonts w:ascii="Calibri" w:hAnsi="Calibri" w:cs="Calibri"/>
+          <w:b/>
+          <w:bCs/>
+          <w:i/>
+          <w:iCs/>
+          <w:color w:val="5B9BD5"/>
+          <w:sz w:val="28"/>
+          <w:szCs w:val="28"/>
+        </w:rPr>
+        <w:t xml:space="preserve">a </w:t>
+      </w:r>
+      <w:r>
+        <w:rPr>
+          <w:rFonts w:ascii="Aptos" w:hAnsi="Aptos" w:cs="Calibri"/>
+          <w:i/>
+          <w:iCs/>
+          <w:color w:val="000000"/>
+          <w:shd w:val="clear" w:color="auto" w:fill="FFFFFF"/>
+        </w:rPr>
+        <w:t xml:space="preserve">Contains </w:t>
+      </w:r>
+      <w:r>
+        <w:rPr>
+          <w:rFonts w:ascii="Calibri" w:hAnsi="Calibri" w:cs="Calibri"/>
+          <w:b/>
+          <w:bCs/>
+          <w:i/>
+          <w:iCs/>
+          <w:color w:val="00B050"/>
+          <w:sz w:val="28"/>
+          <w:szCs w:val="28"/>
+        </w:rPr>
+        <w:t>b</w:t>
+      </w:r>
+      <w:r>
+        <w:rPr>
+          <w:rFonts w:ascii="Aptos" w:hAnsi="Aptos" w:cs="Calibri"/>
+          <w:color w:val="000000"/>
+          <w:shd w:val="clear" w:color="auto" w:fill="FFFFFF"/>
+        </w:rPr>
+        <w:t xml:space="preserve"> and </w:t>
+      </w:r>
+      <w:r>
+        <w:rPr>
+          <w:rFonts w:ascii="Calibri" w:hAnsi="Calibri" w:cs="Calibri"/>
+          <w:b/>
+          <w:bCs/>
+          <w:i/>
+          <w:iCs/>
+          <w:color w:val="00B050"/>
+          <w:sz w:val="28"/>
+          <w:szCs w:val="28"/>
+        </w:rPr>
+        <w:t xml:space="preserve">b </w:t>
+      </w:r>
+      <w:r>
+        <w:rPr>
+          <w:rFonts w:ascii="Aptos" w:hAnsi="Aptos" w:cs="Calibri"/>
+          <w:i/>
+          <w:iCs/>
+          <w:color w:val="000000"/>
+          <w:shd w:val="clear" w:color="auto" w:fill="FFFFFF"/>
+        </w:rPr>
+        <w:t xml:space="preserve">Contains </w:t>
+      </w:r>
+      <w:r>
+        <w:rPr>
+          <w:rFonts w:ascii="Calibri" w:hAnsi="Calibri" w:cs="Calibri"/>
+          <w:b/>
+          <w:bCs/>
+          <w:i/>
+          <w:iCs/>
+          <w:color w:val="D39307"/>
+          <w:sz w:val="28"/>
+          <w:szCs w:val="28"/>
+        </w:rPr>
+        <w:t>c</w:t>
+      </w:r>
+      <w:r>
+        <w:rPr>
+          <w:rFonts w:ascii="Arial" w:hAnsi="Arial" w:cs="Arial"/>
+          <w:color w:val="202122"/>
+          <w:sz w:val="21"/>
+          <w:szCs w:val="21"/>
+        </w:rPr>
+        <w:t xml:space="preserve">, therefore the relationship </w:t>
+      </w:r>
+      <w:r>
+        <w:rPr>
+          <w:rFonts w:ascii="Calibri" w:hAnsi="Calibri" w:cs="Calibri"/>
+          <w:b/>
+          <w:bCs/>
+          <w:i/>
+          <w:iCs/>
+          <w:color w:val="5B9BD5"/>
+          <w:sz w:val="28"/>
+          <w:szCs w:val="28"/>
+        </w:rPr>
+        <w:t>a</w:t>
+      </w:r>
+      <w:r>
+        <w:rPr>
+          <w:rFonts w:ascii="Aptos" w:hAnsi="Aptos" w:cs="Calibri"/>
+          <w:i/>
+          <w:iCs/>
+          <w:color w:val="000000"/>
+          <w:shd w:val="clear" w:color="auto" w:fill="FFFFFF"/>
+        </w:rPr>
+        <w:t xml:space="preserve"> Contains</w:t>
+      </w:r>
+      <w:r>
+        <w:rPr>
+          <w:rFonts w:ascii="Calibri" w:hAnsi="Calibri" w:cs="Calibri"/>
+          <w:b/>
+          <w:bCs/>
+          <w:i/>
+          <w:iCs/>
+          <w:color w:val="D39307"/>
+          <w:sz w:val="28"/>
+          <w:szCs w:val="28"/>
+        </w:rPr>
+        <w:t xml:space="preserve"> c</w:t>
+      </w:r>
+      <w:r>
+        <w:rPr>
+          <w:rFonts w:ascii="Aptos" w:hAnsi="Aptos" w:cs="Calibri"/>
+          <w:color w:val="000000"/>
+          <w:shd w:val="clear" w:color="auto" w:fill="FFFFFF"/>
+        </w:rPr>
+        <w:t xml:space="preserve"> </w:t>
+      </w:r>
+      <w:r>
+        <w:rPr>
+          <w:rFonts w:ascii="Aptos" w:hAnsi="Aptos" w:cs="Calibri"/>
+          <w:color w:val="000000"/>
+          <w:shd w:val="clear" w:color="auto" w:fill="FFFFFF"/>
+        </w:rPr>
+        <w:t xml:space="preserve">is a </w:t>
+      </w:r>
+      <w:r>
+        <w:rPr>
+          <w:rFonts w:ascii="Aptos" w:hAnsi="Aptos" w:cs="Calibri"/>
+          <w:b/>
+          <w:bCs/>
+          <w:color w:val="000000"/>
+          <w:shd w:val="clear" w:color="auto" w:fill="FFFFFF"/>
+        </w:rPr>
+        <w:t>L</w:t>
+      </w:r>
+      <w:r>
+        <w:rPr>
+          <w:rFonts w:ascii="Aptos" w:hAnsi="Aptos" w:cs="Calibri"/>
+          <w:b/>
+          <w:bCs/>
+          <w:color w:val="000000"/>
+          <w:shd w:val="clear" w:color="auto" w:fill="FFFFFF"/>
+        </w:rPr>
+        <w:t>ogical</w:t>
+      </w:r>
+      <w:r>
+        <w:rPr>
+          <w:rFonts w:ascii="Aptos" w:hAnsi="Aptos" w:cs="Calibri"/>
+          <w:color w:val="000000"/>
+          <w:shd w:val="clear" w:color="auto" w:fill="FFFFFF"/>
+        </w:rPr>
+        <w:t xml:space="preserve"> one since it is a requirement of the other two relationships.</w:t>
+      </w:r>
+      <w:r>
+        <w:rPr>
+          <w:rFonts w:ascii="Aptos" w:hAnsi="Aptos" w:cs="Calibri"/>
+          <w:color w:val="000000"/>
+          <w:shd w:val="clear" w:color="auto" w:fill="FFFFFF"/>
+        </w:rPr>
+        <w:t xml:space="preserve">  Logical relationships can also be chained further. For example, if </w:t>
+      </w:r>
+      <w:r>
+        <w:rPr>
+          <w:rFonts w:ascii="Calibri" w:hAnsi="Calibri" w:cs="Calibri"/>
+          <w:b/>
+          <w:bCs/>
+          <w:i/>
+          <w:iCs/>
+          <w:color w:val="D39307"/>
+          <w:sz w:val="28"/>
+          <w:szCs w:val="28"/>
+        </w:rPr>
+        <w:t>c</w:t>
+      </w:r>
+      <w:r>
+        <w:rPr>
+          <w:rFonts w:ascii="Calibri" w:hAnsi="Calibri" w:cs="Calibri"/>
+          <w:b/>
+          <w:bCs/>
+          <w:i/>
+          <w:iCs/>
+          <w:color w:val="00B050"/>
+          <w:sz w:val="28"/>
+          <w:szCs w:val="28"/>
+        </w:rPr>
+        <w:t xml:space="preserve"> </w:t>
+      </w:r>
+      <w:r>
+        <w:rPr>
+          <w:rFonts w:ascii="Aptos" w:hAnsi="Aptos" w:cs="Calibri"/>
+          <w:i/>
+          <w:iCs/>
+          <w:color w:val="000000"/>
+          <w:shd w:val="clear" w:color="auto" w:fill="FFFFFF"/>
+        </w:rPr>
+        <w:t xml:space="preserve">Contains </w:t>
+      </w:r>
+      <w:r>
+        <w:rPr>
+          <w:rFonts w:ascii="Calibri" w:hAnsi="Calibri" w:cs="Calibri"/>
+          <w:b/>
+          <w:bCs/>
+          <w:i/>
+          <w:iCs/>
+          <w:color w:val="7030A0"/>
+          <w:sz w:val="28"/>
+          <w:szCs w:val="28"/>
+        </w:rPr>
+        <w:t>d</w:t>
+      </w:r>
+      <w:r>
+        <w:rPr>
+          <w:rFonts w:ascii="Aptos" w:hAnsi="Aptos" w:cs="Calibri"/>
+          <w:color w:val="000000"/>
+          <w:shd w:val="clear" w:color="auto" w:fill="FFFFFF"/>
+        </w:rPr>
+        <w:t>, the re</w:t>
+      </w:r>
+      <w:r>
+        <w:rPr>
+          <w:rFonts w:ascii="Aptos" w:hAnsi="Aptos" w:cs="Calibri"/>
+          <w:color w:val="000000"/>
+          <w:shd w:val="clear" w:color="auto" w:fill="FFFFFF"/>
+        </w:rPr>
+        <w:t>lationships</w:t>
+      </w:r>
+      <w:r>
+        <w:rPr>
+          <w:rFonts w:ascii="Aptos" w:hAnsi="Aptos" w:cs="Calibri"/>
+          <w:color w:val="000000"/>
+          <w:shd w:val="clear" w:color="auto" w:fill="FFFFFF"/>
+        </w:rPr>
+        <w:t xml:space="preserve"> </w:t>
+      </w:r>
+      <w:r>
+        <w:rPr>
+          <w:rFonts w:ascii="Calibri" w:hAnsi="Calibri" w:cs="Calibri"/>
+          <w:b/>
+          <w:bCs/>
+          <w:i/>
+          <w:iCs/>
+          <w:color w:val="5B9BD5"/>
+          <w:sz w:val="28"/>
+          <w:szCs w:val="28"/>
+        </w:rPr>
+        <w:t xml:space="preserve">a </w:t>
+      </w:r>
+      <w:r>
+        <w:rPr>
+          <w:rFonts w:ascii="Aptos" w:hAnsi="Aptos" w:cs="Calibri"/>
+          <w:i/>
+          <w:iCs/>
+          <w:color w:val="000000"/>
+          <w:shd w:val="clear" w:color="auto" w:fill="FFFFFF"/>
+        </w:rPr>
+        <w:t xml:space="preserve">Contains </w:t>
+      </w:r>
+      <w:r>
+        <w:rPr>
+          <w:rFonts w:ascii="Calibri" w:hAnsi="Calibri" w:cs="Calibri"/>
+          <w:b/>
+          <w:bCs/>
+          <w:i/>
+          <w:iCs/>
+          <w:color w:val="7030A0"/>
+          <w:sz w:val="28"/>
+          <w:szCs w:val="28"/>
+        </w:rPr>
+        <w:t>d</w:t>
+      </w:r>
+      <w:r>
+        <w:rPr>
+          <w:rFonts w:ascii="Aptos" w:hAnsi="Aptos" w:cs="Calibri"/>
+          <w:color w:val="000000"/>
+          <w:shd w:val="clear" w:color="auto" w:fill="FFFFFF"/>
+        </w:rPr>
+        <w:t xml:space="preserve"> and </w:t>
+      </w:r>
+      <w:r>
+        <w:rPr>
+          <w:rFonts w:ascii="Calibri" w:hAnsi="Calibri" w:cs="Calibri"/>
+          <w:b/>
+          <w:bCs/>
+          <w:i/>
+          <w:iCs/>
+          <w:color w:val="00B050"/>
+          <w:sz w:val="28"/>
+          <w:szCs w:val="28"/>
+        </w:rPr>
+        <w:t xml:space="preserve">b </w:t>
+      </w:r>
+      <w:r>
+        <w:rPr>
+          <w:rFonts w:ascii="Aptos" w:hAnsi="Aptos" w:cs="Calibri"/>
+          <w:i/>
+          <w:iCs/>
+          <w:color w:val="000000"/>
+          <w:shd w:val="clear" w:color="auto" w:fill="FFFFFF"/>
+        </w:rPr>
+        <w:t xml:space="preserve">Contains </w:t>
+      </w:r>
+      <w:r>
+        <w:rPr>
+          <w:rFonts w:ascii="Calibri" w:hAnsi="Calibri" w:cs="Calibri"/>
+          <w:b/>
+          <w:bCs/>
+          <w:i/>
+          <w:iCs/>
+          <w:color w:val="7030A0"/>
+          <w:sz w:val="28"/>
+          <w:szCs w:val="28"/>
+        </w:rPr>
+        <w:t>d</w:t>
+      </w:r>
+      <w:r>
+        <w:rPr>
+          <w:rFonts w:ascii="Aptos" w:hAnsi="Aptos" w:cs="Calibri"/>
+          <w:color w:val="000000"/>
+          <w:shd w:val="clear" w:color="auto" w:fill="FFFFFF"/>
+        </w:rPr>
+        <w:t xml:space="preserve"> </w:t>
+      </w:r>
+      <w:r>
+        <w:rPr>
+          <w:rFonts w:ascii="Aptos" w:hAnsi="Aptos" w:cs="Calibri"/>
+          <w:color w:val="000000"/>
+          <w:shd w:val="clear" w:color="auto" w:fill="FFFFFF"/>
+        </w:rPr>
+        <w:t>are</w:t>
+      </w:r>
+      <w:r>
+        <w:rPr>
+          <w:rFonts w:ascii="Aptos" w:hAnsi="Aptos" w:cs="Calibri"/>
+          <w:color w:val="000000"/>
+          <w:shd w:val="clear" w:color="auto" w:fill="FFFFFF"/>
+        </w:rPr>
+        <w:t xml:space="preserve"> </w:t>
+      </w:r>
+      <w:r>
+        <w:rPr>
+          <w:rFonts w:ascii="Aptos" w:hAnsi="Aptos" w:cs="Calibri"/>
+          <w:color w:val="000000"/>
+          <w:shd w:val="clear" w:color="auto" w:fill="FFFFFF"/>
+        </w:rPr>
+        <w:t>both</w:t>
+      </w:r>
+      <w:r>
+        <w:rPr>
+          <w:rFonts w:ascii="Aptos" w:hAnsi="Aptos" w:cs="Calibri"/>
+          <w:color w:val="000000"/>
+          <w:shd w:val="clear" w:color="auto" w:fill="FFFFFF"/>
+        </w:rPr>
+        <w:t xml:space="preserve"> </w:t>
+      </w:r>
+      <w:r>
+        <w:rPr>
+          <w:rFonts w:ascii="Aptos" w:hAnsi="Aptos" w:cs="Calibri"/>
+          <w:b/>
+          <w:bCs/>
+          <w:color w:val="000000"/>
+          <w:shd w:val="clear" w:color="auto" w:fill="FFFFFF"/>
+        </w:rPr>
+        <w:t>C</w:t>
+      </w:r>
+      <w:r>
+        <w:rPr>
+          <w:rFonts w:ascii="Aptos" w:hAnsi="Aptos" w:cs="Calibri"/>
+          <w:color w:val="000000"/>
+          <w:shd w:val="clear" w:color="auto" w:fill="FFFFFF"/>
+        </w:rPr>
+        <w:t xml:space="preserve">. </w:t>
+      </w:r>
+    </w:p>
+    <w:p>
+      <w:pPr>
+        <w:rPr>
+          <w:rFonts w:ascii="Arial" w:hAnsi="Arial" w:cs="Arial"/>
+          <w:color w:val="202122"/>
+          <w:sz w:val="21"/>
+          <w:szCs w:val="21"/>
+        </w:rPr>
+      </w:pPr>
+      <w:r>
+        <w:t>Identifying</w:t>
+      </w:r>
+      <w:r>
+        <w:t xml:space="preserve"> </w:t>
+      </w:r>
+      <w:r>
+        <w:rPr>
+          <w:rFonts w:ascii="Aptos" w:hAnsi="Aptos" w:cs="Calibri"/>
+          <w:b/>
+          <w:bCs/>
+          <w:color w:val="000000"/>
+          <w:shd w:val="clear" w:color="auto" w:fill="FFFFFF"/>
+        </w:rPr>
+        <w:t>L</w:t>
+      </w:r>
+      <w:r>
+        <w:rPr>
+          <w:rFonts w:ascii="Aptos" w:hAnsi="Aptos" w:cs="Calibri"/>
+          <w:b/>
+          <w:bCs/>
+          <w:color w:val="000000"/>
+          <w:shd w:val="clear" w:color="auto" w:fill="FFFFFF"/>
+        </w:rPr>
+        <w:t>ogical</w:t>
+      </w:r>
+      <w:r>
+        <w:t xml:space="preserve"> relationships is complicated by the fact that some relationships Imply other ones</w:t>
+      </w:r>
+      <w:r>
+        <w:t xml:space="preserve">.  For example, </w:t>
+      </w:r>
+      <w:r>
+        <w:rPr>
+          <w:rFonts w:ascii="Aptos" w:hAnsi="Aptos" w:cs="Calibri"/>
+          <w:i/>
+          <w:iCs/>
+          <w:color w:val="000000"/>
+          <w:shd w:val="clear" w:color="auto" w:fill="FFFFFF"/>
+        </w:rPr>
+        <w:t>Partitioned</w:t>
+      </w:r>
+      <w:r>
+        <w:rPr>
+          <w:rFonts w:ascii="Aptos" w:hAnsi="Aptos" w:cs="Calibri"/>
+          <w:i/>
+          <w:iCs/>
+          <w:color w:val="000000"/>
+          <w:shd w:val="clear" w:color="auto" w:fill="FFFFFF"/>
+        </w:rPr>
+        <w:t xml:space="preserve"> </w:t>
+      </w:r>
+      <w:r>
+        <w:t xml:space="preserve">is not transitive, but it implies </w:t>
+      </w:r>
+      <w:r>
+        <w:rPr>
+          <w:rFonts w:ascii="Aptos" w:hAnsi="Aptos" w:cs="Calibri"/>
+          <w:i/>
+          <w:iCs/>
+          <w:color w:val="000000"/>
+          <w:shd w:val="clear" w:color="auto" w:fill="FFFFFF"/>
+        </w:rPr>
+        <w:t>Contains</w:t>
+      </w:r>
+      <w:r>
+        <w:t xml:space="preserve"> </w:t>
+      </w:r>
+      <w:r>
+        <w:t>so the following scenario is possible: If</w:t>
+      </w:r>
+      <w:r>
+        <w:t xml:space="preserve"> </w:t>
+      </w:r>
+      <w:r>
+        <w:rPr>
+          <w:rFonts w:ascii="Calibri" w:hAnsi="Calibri" w:cs="Calibri"/>
+          <w:b/>
+          <w:bCs/>
+          <w:i/>
+          <w:iCs/>
+          <w:color w:val="5B9BD5"/>
+          <w:sz w:val="28"/>
+          <w:szCs w:val="28"/>
+        </w:rPr>
+        <w:t>a</w:t>
+      </w:r>
+      <w:r>
+        <w:rPr>
+          <w:rFonts w:ascii="Aptos" w:hAnsi="Aptos" w:cs="Calibri"/>
+          <w:i/>
+          <w:iCs/>
+          <w:color w:val="000000"/>
+          <w:shd w:val="clear" w:color="auto" w:fill="FFFFFF"/>
+        </w:rPr>
+        <w:t xml:space="preserve"> </w:t>
+      </w:r>
+      <w:r>
+        <w:rPr>
+          <w:rFonts w:ascii="Aptos" w:hAnsi="Aptos" w:cs="Calibri"/>
+          <w:i/>
+          <w:iCs/>
+          <w:color w:val="000000"/>
+          <w:shd w:val="clear" w:color="auto" w:fill="FFFFFF"/>
+        </w:rPr>
+        <w:t xml:space="preserve">Is </w:t>
+      </w:r>
+      <w:r>
+        <w:rPr>
+          <w:rFonts w:ascii="Aptos" w:hAnsi="Aptos" w:cs="Calibri"/>
+          <w:i/>
+          <w:iCs/>
+          <w:color w:val="000000"/>
+          <w:shd w:val="clear" w:color="auto" w:fill="FFFFFF"/>
+        </w:rPr>
+        <w:t>Partitioned</w:t>
+      </w:r>
+      <w:r>
+        <w:rPr>
+          <w:rFonts w:ascii="Aptos" w:hAnsi="Aptos" w:cs="Calibri"/>
+          <w:i/>
+          <w:iCs/>
+          <w:color w:val="000000"/>
+          <w:shd w:val="clear" w:color="auto" w:fill="FFFFFF"/>
+        </w:rPr>
+        <w:t xml:space="preserve"> by</w:t>
+      </w:r>
+      <w:r>
+        <w:rPr>
+          <w:rFonts w:ascii="Aptos" w:hAnsi="Aptos" w:cs="Calibri"/>
+          <w:i/>
+          <w:iCs/>
+          <w:color w:val="000000"/>
+          <w:shd w:val="clear" w:color="auto" w:fill="FFFFFF"/>
+        </w:rPr>
+        <w:t xml:space="preserve"> </w:t>
+      </w:r>
+      <w:r>
+        <w:rPr>
+          <w:rFonts w:ascii="Calibri" w:hAnsi="Calibri" w:cs="Calibri"/>
+          <w:b/>
+          <w:bCs/>
+          <w:i/>
+          <w:iCs/>
+          <w:color w:val="00B050"/>
+          <w:sz w:val="28"/>
+          <w:szCs w:val="28"/>
+        </w:rPr>
+        <w:t>b</w:t>
+      </w:r>
+      <w:r>
+        <w:rPr>
+          <w:rFonts w:ascii="Aptos" w:hAnsi="Aptos" w:cs="Calibri"/>
+          <w:color w:val="000000"/>
+          <w:shd w:val="clear" w:color="auto" w:fill="FFFFFF"/>
+        </w:rPr>
+        <w:t xml:space="preserve"> and </w:t>
+      </w:r>
+      <w:r>
+        <w:rPr>
+          <w:rFonts w:ascii="Calibri" w:hAnsi="Calibri" w:cs="Calibri"/>
+          <w:b/>
+          <w:bCs/>
+          <w:i/>
+          <w:iCs/>
+          <w:color w:val="00B050"/>
+          <w:sz w:val="28"/>
+          <w:szCs w:val="28"/>
+        </w:rPr>
+        <w:t xml:space="preserve">b </w:t>
+      </w:r>
+      <w:r>
+        <w:rPr>
+          <w:rFonts w:ascii="Aptos" w:hAnsi="Aptos" w:cs="Calibri"/>
+          <w:i/>
+          <w:iCs/>
+          <w:color w:val="000000"/>
+          <w:shd w:val="clear" w:color="auto" w:fill="FFFFFF"/>
+        </w:rPr>
+        <w:t xml:space="preserve">Contains </w:t>
+      </w:r>
+      <w:r>
+        <w:rPr>
+          <w:rFonts w:ascii="Calibri" w:hAnsi="Calibri" w:cs="Calibri"/>
+          <w:b/>
+          <w:bCs/>
+          <w:i/>
+          <w:iCs/>
+          <w:color w:val="D39307"/>
+          <w:sz w:val="28"/>
+          <w:szCs w:val="28"/>
+        </w:rPr>
+        <w:t>c</w:t>
+      </w:r>
+      <w:r>
+        <w:rPr>
+          <w:rFonts w:ascii="Arial" w:hAnsi="Arial" w:cs="Arial"/>
+          <w:color w:val="202122"/>
+          <w:sz w:val="21"/>
+          <w:szCs w:val="21"/>
+        </w:rPr>
+        <w:t xml:space="preserve"> </w:t>
+      </w:r>
+      <w:r>
+        <w:rPr>
+          <w:rFonts w:ascii="Arial" w:hAnsi="Arial" w:cs="Arial"/>
+          <w:color w:val="202122"/>
+          <w:sz w:val="21"/>
+          <w:szCs w:val="21"/>
+        </w:rPr>
+        <w:t xml:space="preserve">the relationship </w:t>
+      </w:r>
+      <w:r>
+        <w:rPr>
+          <w:rFonts w:ascii="Calibri" w:hAnsi="Calibri" w:cs="Calibri"/>
+          <w:b/>
+          <w:bCs/>
+          <w:i/>
+          <w:iCs/>
+          <w:color w:val="5B9BD5"/>
+          <w:sz w:val="28"/>
+          <w:szCs w:val="28"/>
+        </w:rPr>
+        <w:t>a</w:t>
+      </w:r>
+      <w:r>
+        <w:rPr>
+          <w:rFonts w:ascii="Aptos" w:hAnsi="Aptos" w:cs="Calibri"/>
+          <w:i/>
+          <w:iCs/>
+          <w:color w:val="000000"/>
+          <w:shd w:val="clear" w:color="auto" w:fill="FFFFFF"/>
+        </w:rPr>
+        <w:t xml:space="preserve"> Contains</w:t>
+      </w:r>
+      <w:r>
+        <w:rPr>
+          <w:rFonts w:ascii="Calibri" w:hAnsi="Calibri" w:cs="Calibri"/>
+          <w:b/>
+          <w:bCs/>
+          <w:i/>
+          <w:iCs/>
+          <w:color w:val="D39307"/>
+          <w:sz w:val="28"/>
+          <w:szCs w:val="28"/>
+        </w:rPr>
+        <w:t xml:space="preserve"> c</w:t>
+      </w:r>
+      <w:r>
+        <w:rPr>
+          <w:rFonts w:ascii="Aptos" w:hAnsi="Aptos" w:cs="Calibri"/>
+          <w:color w:val="000000"/>
+          <w:shd w:val="clear" w:color="auto" w:fill="FFFFFF"/>
+        </w:rPr>
+        <w:t xml:space="preserve"> is </w:t>
+      </w:r>
+      <w:r>
+        <w:rPr>
+          <w:rFonts w:ascii="Aptos" w:hAnsi="Aptos" w:cs="Calibri"/>
+          <w:b/>
+          <w:bCs/>
+          <w:color w:val="000000"/>
+          <w:shd w:val="clear" w:color="auto" w:fill="FFFFFF"/>
+        </w:rPr>
+        <w:t>L</w:t>
+      </w:r>
+      <w:r>
+        <w:rPr>
+          <w:rFonts w:ascii="Aptos" w:hAnsi="Aptos" w:cs="Calibri"/>
+          <w:b/>
+          <w:bCs/>
+          <w:color w:val="000000"/>
+          <w:shd w:val="clear" w:color="auto" w:fill="FFFFFF"/>
+        </w:rPr>
+        <w:t>ogical</w:t>
+      </w:r>
+      <w:r>
+        <w:rPr>
+          <w:rFonts w:ascii="Aptos" w:hAnsi="Aptos" w:cs="Calibri"/>
+          <w:color w:val="000000"/>
+          <w:shd w:val="clear" w:color="auto" w:fill="FFFFFF"/>
+        </w:rPr>
+        <w:t xml:space="preserve">.  However, </w:t>
+      </w:r>
+      <w:proofErr w:type="gramStart"/>
+      <w:r>
+        <w:t>If</w:t>
+      </w:r>
+      <w:proofErr w:type="gramEnd"/>
+      <w:r>
+        <w:t xml:space="preserve"> </w:t>
+      </w:r>
+      <w:r>
+        <w:rPr>
+          <w:rFonts w:ascii="Calibri" w:hAnsi="Calibri" w:cs="Calibri"/>
+          <w:b/>
+          <w:bCs/>
+          <w:i/>
+          <w:iCs/>
+          <w:color w:val="5B9BD5"/>
+          <w:sz w:val="28"/>
+          <w:szCs w:val="28"/>
+        </w:rPr>
+        <w:t>a</w:t>
+      </w:r>
+      <w:r>
+        <w:rPr>
+          <w:rFonts w:ascii="Aptos" w:hAnsi="Aptos" w:cs="Calibri"/>
+          <w:i/>
+          <w:iCs/>
+          <w:color w:val="000000"/>
+          <w:shd w:val="clear" w:color="auto" w:fill="FFFFFF"/>
+        </w:rPr>
+        <w:t xml:space="preserve"> Is Partitioned</w:t>
+      </w:r>
+      <w:r>
+        <w:rPr>
+          <w:rFonts w:ascii="Aptos" w:hAnsi="Aptos" w:cs="Calibri"/>
+          <w:i/>
+          <w:iCs/>
+          <w:color w:val="000000"/>
+          <w:shd w:val="clear" w:color="auto" w:fill="FFFFFF"/>
+        </w:rPr>
+        <w:t xml:space="preserve"> by </w:t>
+      </w:r>
+      <w:r>
+        <w:rPr>
+          <w:rFonts w:ascii="Calibri" w:hAnsi="Calibri" w:cs="Calibri"/>
+          <w:b/>
+          <w:bCs/>
+          <w:i/>
+          <w:iCs/>
+          <w:color w:val="00B050"/>
+          <w:sz w:val="28"/>
+          <w:szCs w:val="28"/>
+        </w:rPr>
+        <w:t>b</w:t>
+      </w:r>
+      <w:r>
+        <w:rPr>
+          <w:rFonts w:ascii="Aptos" w:hAnsi="Aptos" w:cs="Calibri"/>
+          <w:color w:val="000000"/>
+          <w:shd w:val="clear" w:color="auto" w:fill="FFFFFF"/>
+        </w:rPr>
+        <w:t xml:space="preserve"> and </w:t>
+      </w:r>
+      <w:r>
+        <w:rPr>
+          <w:rFonts w:ascii="Calibri" w:hAnsi="Calibri" w:cs="Calibri"/>
+          <w:b/>
+          <w:bCs/>
+          <w:i/>
+          <w:iCs/>
+          <w:color w:val="00B050"/>
+          <w:sz w:val="28"/>
+          <w:szCs w:val="28"/>
+        </w:rPr>
+        <w:t xml:space="preserve">b </w:t>
+      </w:r>
+      <w:r>
+        <w:rPr>
+          <w:rFonts w:ascii="Aptos" w:hAnsi="Aptos" w:cs="Calibri"/>
+          <w:i/>
+          <w:iCs/>
+          <w:color w:val="000000"/>
+          <w:shd w:val="clear" w:color="auto" w:fill="FFFFFF"/>
+        </w:rPr>
+        <w:t>Is Partitioned</w:t>
+      </w:r>
+      <w:r>
+        <w:rPr>
+          <w:rFonts w:ascii="Aptos" w:hAnsi="Aptos" w:cs="Calibri"/>
+          <w:i/>
+          <w:iCs/>
+          <w:color w:val="000000"/>
+          <w:shd w:val="clear" w:color="auto" w:fill="FFFFFF"/>
+        </w:rPr>
+        <w:t xml:space="preserve"> by</w:t>
+      </w:r>
+      <w:r>
+        <w:rPr>
+          <w:rFonts w:ascii="Calibri" w:hAnsi="Calibri" w:cs="Calibri"/>
+          <w:b/>
+          <w:bCs/>
+          <w:i/>
+          <w:iCs/>
+          <w:color w:val="D39307"/>
+          <w:sz w:val="28"/>
+          <w:szCs w:val="28"/>
+        </w:rPr>
+        <w:t xml:space="preserve"> </w:t>
+      </w:r>
+      <w:r>
+        <w:rPr>
+          <w:rFonts w:ascii="Calibri" w:hAnsi="Calibri" w:cs="Calibri"/>
+          <w:b/>
+          <w:bCs/>
+          <w:i/>
+          <w:iCs/>
+          <w:color w:val="D39307"/>
+          <w:sz w:val="28"/>
+          <w:szCs w:val="28"/>
+        </w:rPr>
+        <w:t>c</w:t>
+      </w:r>
+      <w:r>
+        <w:rPr>
+          <w:rFonts w:ascii="Arial" w:hAnsi="Arial" w:cs="Arial"/>
+          <w:color w:val="202122"/>
+          <w:sz w:val="21"/>
+          <w:szCs w:val="21"/>
+        </w:rPr>
+        <w:t xml:space="preserve"> </w:t>
+      </w:r>
+      <w:r>
+        <w:rPr>
+          <w:rFonts w:ascii="Arial" w:hAnsi="Arial" w:cs="Arial"/>
+          <w:color w:val="202122"/>
+          <w:sz w:val="21"/>
+          <w:szCs w:val="21"/>
+        </w:rPr>
+        <w:t xml:space="preserve">either </w:t>
+      </w:r>
+      <w:r>
+        <w:rPr>
+          <w:rFonts w:ascii="Arial" w:hAnsi="Arial" w:cs="Arial"/>
+          <w:color w:val="202122"/>
+          <w:sz w:val="21"/>
+          <w:szCs w:val="21"/>
+        </w:rPr>
+        <w:t xml:space="preserve">the relationship </w:t>
+      </w:r>
+      <w:r>
+        <w:rPr>
+          <w:rFonts w:ascii="Calibri" w:hAnsi="Calibri" w:cs="Calibri"/>
+          <w:b/>
+          <w:bCs/>
+          <w:i/>
+          <w:iCs/>
+          <w:color w:val="5B9BD5"/>
+          <w:sz w:val="28"/>
+          <w:szCs w:val="28"/>
+        </w:rPr>
+        <w:t>a</w:t>
+      </w:r>
+      <w:r>
+        <w:rPr>
+          <w:rFonts w:ascii="Aptos" w:hAnsi="Aptos" w:cs="Calibri"/>
+          <w:i/>
+          <w:iCs/>
+          <w:color w:val="000000"/>
+          <w:shd w:val="clear" w:color="auto" w:fill="FFFFFF"/>
+        </w:rPr>
+        <w:t xml:space="preserve"> Contains</w:t>
+      </w:r>
+      <w:r>
+        <w:rPr>
+          <w:rFonts w:ascii="Calibri" w:hAnsi="Calibri" w:cs="Calibri"/>
+          <w:b/>
+          <w:bCs/>
+          <w:i/>
+          <w:iCs/>
+          <w:color w:val="D39307"/>
+          <w:sz w:val="28"/>
+          <w:szCs w:val="28"/>
+        </w:rPr>
+        <w:t xml:space="preserve"> c</w:t>
+      </w:r>
+      <w:r>
+        <w:rPr>
+          <w:rFonts w:ascii="Arial" w:hAnsi="Arial" w:cs="Arial"/>
+          <w:color w:val="202122"/>
+          <w:sz w:val="21"/>
+          <w:szCs w:val="21"/>
+        </w:rPr>
+        <w:t xml:space="preserve"> or the relationship </w:t>
+      </w:r>
+      <w:r>
+        <w:rPr>
+          <w:rFonts w:ascii="Calibri" w:hAnsi="Calibri" w:cs="Calibri"/>
+          <w:b/>
+          <w:bCs/>
+          <w:i/>
+          <w:iCs/>
+          <w:color w:val="5B9BD5"/>
+          <w:sz w:val="28"/>
+          <w:szCs w:val="28"/>
+        </w:rPr>
+        <w:t>a</w:t>
+      </w:r>
+      <w:r>
+        <w:rPr>
+          <w:rFonts w:ascii="Aptos" w:hAnsi="Aptos" w:cs="Calibri"/>
+          <w:i/>
+          <w:iCs/>
+          <w:color w:val="000000"/>
+          <w:shd w:val="clear" w:color="auto" w:fill="FFFFFF"/>
+        </w:rPr>
+        <w:t xml:space="preserve"> </w:t>
+      </w:r>
+      <w:r>
+        <w:rPr>
+          <w:rFonts w:ascii="Aptos" w:hAnsi="Aptos" w:cs="Calibri"/>
+          <w:i/>
+          <w:iCs/>
+          <w:color w:val="000000"/>
+          <w:shd w:val="clear" w:color="auto" w:fill="FFFFFF"/>
+        </w:rPr>
+        <w:t>Is Partitioned</w:t>
+      </w:r>
+      <w:r>
+        <w:rPr>
+          <w:rFonts w:ascii="Aptos" w:hAnsi="Aptos" w:cs="Calibri"/>
+          <w:i/>
+          <w:iCs/>
+          <w:color w:val="000000"/>
+          <w:shd w:val="clear" w:color="auto" w:fill="FFFFFF"/>
+        </w:rPr>
+        <w:t xml:space="preserve"> by </w:t>
+      </w:r>
+      <w:r>
+        <w:rPr>
+          <w:rFonts w:ascii="Calibri" w:hAnsi="Calibri" w:cs="Calibri"/>
+          <w:b/>
+          <w:bCs/>
+          <w:i/>
+          <w:iCs/>
+          <w:color w:val="D39307"/>
+          <w:sz w:val="28"/>
+          <w:szCs w:val="28"/>
+        </w:rPr>
+        <w:t>c</w:t>
+      </w:r>
+      <w:r>
+        <w:rPr>
+          <w:rFonts w:ascii="Arial" w:hAnsi="Arial" w:cs="Arial"/>
+          <w:color w:val="202122"/>
+          <w:sz w:val="21"/>
+          <w:szCs w:val="21"/>
+        </w:rPr>
+        <w:t xml:space="preserve"> </w:t>
+      </w:r>
+      <w:r>
+        <w:rPr>
+          <w:rFonts w:ascii="Arial" w:hAnsi="Arial" w:cs="Arial"/>
+          <w:color w:val="202122"/>
+          <w:sz w:val="21"/>
+          <w:szCs w:val="21"/>
+        </w:rPr>
+        <w:t>is possible, so a logical relationship does not exist</w:t>
+      </w:r>
+    </w:p>
+    <w:p>
+      <w:pPr>
+        <w:rPr>
+          <w:rFonts w:ascii="Arial" w:hAnsi="Arial" w:cs="Arial"/>
+          <w:color w:val="202122"/>
+          <w:sz w:val="21"/>
+          <w:szCs w:val="21"/>
+        </w:rPr>
+      </w:pPr>
+      <w:r>
+        <w:rPr>
+          <w:rFonts w:ascii="Arial" w:hAnsi="Arial" w:cs="Arial"/>
+          <w:color w:val="202122"/>
+          <w:sz w:val="21"/>
+          <w:szCs w:val="21"/>
+        </w:rPr>
+        <w:t xml:space="preserve">To identify logical </w:t>
+      </w:r>
+      <w:r>
+        <w:rPr>
+          <w:rFonts w:ascii="Aptos" w:hAnsi="Aptos" w:cs="Calibri"/>
+          <w:i/>
+          <w:iCs/>
+          <w:color w:val="000000"/>
+          <w:shd w:val="clear" w:color="auto" w:fill="FFFFFF"/>
+        </w:rPr>
+        <w:t>Contains</w:t>
+      </w:r>
+      <w:r>
+        <w:rPr>
+          <w:rFonts w:ascii="Aptos" w:hAnsi="Aptos" w:cs="Calibri"/>
+          <w:i/>
+          <w:iCs/>
+          <w:color w:val="000000"/>
+          <w:shd w:val="clear" w:color="auto" w:fill="FFFFFF"/>
+        </w:rPr>
+        <w:t xml:space="preserve"> </w:t>
+      </w:r>
+      <w:r>
+        <w:rPr>
+          <w:rFonts w:ascii="Arial" w:hAnsi="Arial" w:cs="Arial"/>
+          <w:color w:val="202122"/>
+          <w:sz w:val="21"/>
+          <w:szCs w:val="21"/>
+        </w:rPr>
+        <w:t>relationship</w:t>
+      </w:r>
+      <w:r>
+        <w:rPr>
+          <w:rFonts w:ascii="Arial" w:hAnsi="Arial" w:cs="Arial"/>
+          <w:color w:val="202122"/>
+          <w:sz w:val="21"/>
+          <w:szCs w:val="21"/>
+        </w:rPr>
+        <w:t xml:space="preserve">s </w:t>
+      </w:r>
+      <w:r>
+        <w:rPr>
+          <w:rFonts w:ascii="Arial" w:hAnsi="Arial" w:cs="Arial"/>
+          <w:color w:val="202122"/>
+          <w:sz w:val="21"/>
+          <w:szCs w:val="21"/>
+        </w:rPr>
+        <w:t xml:space="preserve">one must construct a directed graph of the structure relations where the edges are all the </w:t>
+      </w:r>
+      <w:r>
+        <w:rPr>
+          <w:rFonts w:ascii="Aptos" w:hAnsi="Aptos" w:cs="Calibri"/>
+          <w:i/>
+          <w:iCs/>
+          <w:color w:val="000000"/>
+          <w:shd w:val="clear" w:color="auto" w:fill="FFFFFF"/>
+        </w:rPr>
+        <w:t xml:space="preserve">Contains </w:t>
+      </w:r>
+      <w:r>
+        <w:rPr>
+          <w:rFonts w:ascii="Arial" w:hAnsi="Arial" w:cs="Arial"/>
+          <w:color w:val="202122"/>
+          <w:sz w:val="21"/>
+          <w:szCs w:val="21"/>
+        </w:rPr>
+        <w:t>relationships</w:t>
+      </w:r>
+      <w:r>
+        <w:rPr>
+          <w:rFonts w:ascii="Arial" w:hAnsi="Arial" w:cs="Arial"/>
+          <w:color w:val="202122"/>
+          <w:sz w:val="21"/>
+          <w:szCs w:val="21"/>
+        </w:rPr>
+        <w:t xml:space="preserve"> in the structure set and all implied </w:t>
+      </w:r>
+      <w:r>
+        <w:rPr>
+          <w:rFonts w:ascii="Aptos" w:hAnsi="Aptos" w:cs="Calibri"/>
+          <w:i/>
+          <w:iCs/>
+          <w:color w:val="000000"/>
+          <w:shd w:val="clear" w:color="auto" w:fill="FFFFFF"/>
+        </w:rPr>
+        <w:lastRenderedPageBreak/>
+        <w:t xml:space="preserve">Contains </w:t>
+      </w:r>
+      <w:r>
+        <w:rPr>
+          <w:rFonts w:ascii="Arial" w:hAnsi="Arial" w:cs="Arial"/>
+          <w:color w:val="202122"/>
+          <w:sz w:val="21"/>
+          <w:szCs w:val="21"/>
+        </w:rPr>
+        <w:t>relationships (</w:t>
+      </w:r>
+      <w:r>
+        <w:rPr>
+          <w:rFonts w:ascii="Aptos" w:hAnsi="Aptos" w:cs="Calibri"/>
+          <w:i/>
+          <w:iCs/>
+          <w:color w:val="000000"/>
+          <w:shd w:val="clear" w:color="auto" w:fill="FFFFFF"/>
+        </w:rPr>
+        <w:t>Partitioned</w:t>
+      </w:r>
+      <w:r>
+        <w:rPr>
+          <w:rFonts w:ascii="Arial" w:hAnsi="Arial" w:cs="Arial"/>
+          <w:color w:val="202122"/>
+          <w:sz w:val="21"/>
+          <w:szCs w:val="21"/>
+        </w:rPr>
+        <w:t>)</w:t>
+      </w:r>
+      <w:r>
+        <w:rPr>
+          <w:rFonts w:ascii="Arial" w:hAnsi="Arial" w:cs="Arial"/>
+          <w:color w:val="202122"/>
+          <w:sz w:val="21"/>
+          <w:szCs w:val="21"/>
+        </w:rPr>
+        <w:t xml:space="preserve"> </w:t>
+      </w:r>
+      <w:r>
+        <w:rPr>
+          <w:rFonts w:ascii="Arial" w:hAnsi="Arial" w:cs="Arial"/>
+          <w:color w:val="202122"/>
+          <w:sz w:val="21"/>
+          <w:szCs w:val="21"/>
+        </w:rPr>
+        <w:t>in the structure set</w:t>
+      </w:r>
+      <w:r>
+        <w:rPr>
+          <w:rFonts w:ascii="Arial" w:hAnsi="Arial" w:cs="Arial"/>
+          <w:color w:val="202122"/>
+          <w:sz w:val="21"/>
+          <w:szCs w:val="21"/>
+        </w:rPr>
+        <w:t>. Next, for each</w:t>
+      </w:r>
+      <w:r>
+        <w:rPr>
+          <w:rFonts w:ascii="Arial" w:hAnsi="Arial" w:cs="Arial"/>
+          <w:color w:val="202122"/>
+          <w:sz w:val="21"/>
+          <w:szCs w:val="21"/>
+        </w:rPr>
+        <w:t xml:space="preserve"> </w:t>
+      </w:r>
+      <w:r>
+        <w:rPr>
+          <w:rFonts w:ascii="Aptos" w:hAnsi="Aptos" w:cs="Calibri"/>
+          <w:i/>
+          <w:iCs/>
+          <w:color w:val="000000"/>
+          <w:shd w:val="clear" w:color="auto" w:fill="FFFFFF"/>
+        </w:rPr>
+        <w:t xml:space="preserve">Contains </w:t>
+      </w:r>
+      <w:r>
+        <w:rPr>
+          <w:rFonts w:ascii="Arial" w:hAnsi="Arial" w:cs="Arial"/>
+          <w:color w:val="202122"/>
+          <w:sz w:val="21"/>
+          <w:szCs w:val="21"/>
+        </w:rPr>
+        <w:t>relationship</w:t>
+      </w:r>
+      <w:r>
+        <w:rPr>
+          <w:rFonts w:ascii="Arial" w:hAnsi="Arial" w:cs="Arial"/>
+          <w:color w:val="202122"/>
+          <w:sz w:val="21"/>
+          <w:szCs w:val="21"/>
+        </w:rPr>
+        <w:t xml:space="preserve"> check for an alternate path between the two structures, Next check that the path is not composed Entirely of </w:t>
+      </w:r>
+      <w:r>
+        <w:rPr>
+          <w:rFonts w:ascii="Arial" w:hAnsi="Arial" w:cs="Arial"/>
+          <w:color w:val="202122"/>
+          <w:sz w:val="21"/>
+          <w:szCs w:val="21"/>
+        </w:rPr>
+        <w:t xml:space="preserve">implied </w:t>
+      </w:r>
+      <w:r>
+        <w:rPr>
+          <w:rFonts w:ascii="Aptos" w:hAnsi="Aptos" w:cs="Calibri"/>
+          <w:i/>
+          <w:iCs/>
+          <w:color w:val="000000"/>
+          <w:shd w:val="clear" w:color="auto" w:fill="FFFFFF"/>
+        </w:rPr>
+        <w:t xml:space="preserve">Contains </w:t>
+      </w:r>
+      <w:r>
+        <w:rPr>
+          <w:rFonts w:ascii="Arial" w:hAnsi="Arial" w:cs="Arial"/>
+          <w:color w:val="202122"/>
+          <w:sz w:val="21"/>
+          <w:szCs w:val="21"/>
+        </w:rPr>
+        <w:t>relationships</w:t>
+      </w:r>
+      <w:r>
+        <w:rPr>
+          <w:rFonts w:ascii="Arial" w:hAnsi="Arial" w:cs="Arial"/>
+          <w:color w:val="202122"/>
+          <w:sz w:val="21"/>
+          <w:szCs w:val="21"/>
+        </w:rPr>
+        <w:t xml:space="preserve">.  If an alternate path exists, then the relationship is </w:t>
+      </w:r>
+      <w:r>
+        <w:rPr>
+          <w:rFonts w:ascii="Aptos" w:hAnsi="Aptos" w:cs="Calibri"/>
+          <w:b/>
+          <w:bCs/>
+          <w:color w:val="000000"/>
+          <w:shd w:val="clear" w:color="auto" w:fill="FFFFFF"/>
+        </w:rPr>
+        <w:t>L</w:t>
+      </w:r>
+      <w:r>
+        <w:rPr>
+          <w:rFonts w:ascii="Aptos" w:hAnsi="Aptos" w:cs="Calibri"/>
+          <w:b/>
+          <w:bCs/>
+          <w:color w:val="000000"/>
+          <w:shd w:val="clear" w:color="auto" w:fill="FFFFFF"/>
+        </w:rPr>
+        <w:t>ogical</w:t>
+      </w:r>
+      <w:r>
+        <w:rPr>
+          <w:rFonts w:ascii="Aptos" w:hAnsi="Aptos" w:cs="Calibri"/>
+          <w:b/>
+          <w:bCs/>
+          <w:color w:val="000000"/>
+          <w:shd w:val="clear" w:color="auto" w:fill="FFFFFF"/>
+        </w:rPr>
+        <w:t>.</w:t>
+      </w:r>
+    </w:p>
     <w:p>
       <w:r>
         <w:br w:type="page"/>
@@ -40568,7 +41834,6 @@
   <w:style w:type="character" w:default="1" w:styleId="DefaultParagraphFont">
     <w:name w:val="Default Paragraph Font"/>
     <w:uiPriority w:val="1"/>
-    <w:semiHidden/>
     <w:unhideWhenUsed/>
   </w:style>
   <w:style w:type="table" w:default="1" w:styleId="TableNormal">

</xml_diff>